<commit_message>
docs: tach User thanh 4 entity, chuan hoa Attendance/WorkoutResult, cap nhat Business Rules
- Tach User -> UserAccount/UserCredential/UserProfile/UserExternalLogin de ho tro Google Login an toan (chong account pre-hijacking)
- Attendance: bo session_id/member_id, chi giu enrollment_id (unique, 1-1 voi Enrollment)
- WorkoutResult: thay session_id+member_id bang enrollment_id, dam bao Member thuc su co dang ky session
- Dong bo SSOT, ERD (mermaid trong Design v2), entity-field-purpose.md
- Business Rules v1.2 draft 3: them BR-59 (Google-login anti pre-hijacking), BR-60 (password-login can UserCredential), BR-61 (WorkoutResult can Enrollment Confirmed)
</commit_message>
<xml_diff>
--- a/docs/SportManagement_BusinessRules_v1.2.docx
+++ b/docs/SportManagement_BusinessRules_v1.2.docx
@@ -59,7 +59,7 @@
           <w:sz w:val="20"/>
           <w:szCs w:val="20"/>
         </w:rPr>
-        <w:t xml:space="preserve">Version 1.2 draft — 09/09/2026</w:t>
+        <w:t>Version 1.2 draft 3 — 10/09/2026</w:t>
       </w:r>
     </w:p>
     <w:p>
@@ -516,6 +516,122 @@
                 <w:szCs w:val="18"/>
               </w:rPr>
               <w:t xml:space="preserve">1.2 draft 1</w:t>
+            </w:r>
+          </w:p>
+        </w:tc>
+      </w:tr>
+      <w:tr>
+        <w:tc>
+          <w:tcPr>
+            <w:tcW w:type="dxa" w:w="1800"/>
+          </w:tcPr>
+          <w:p>
+            <w:r/>
+            <w:r>
+              <w:rPr>
+                <w:sz w:val="18"/>
+              </w:rPr>
+              <w:t>SportManagement Project Team</w:t>
+            </w:r>
+          </w:p>
+        </w:tc>
+        <w:tc>
+          <w:tcPr>
+            <w:tcW w:type="dxa" w:w="1300"/>
+          </w:tcPr>
+          <w:p>
+            <w:r/>
+            <w:r>
+              <w:rPr>
+                <w:sz w:val="18"/>
+              </w:rPr>
+              <w:t>10/09/2026</w:t>
+            </w:r>
+          </w:p>
+        </w:tc>
+        <w:tc>
+          <w:tcPr>
+            <w:tcW w:type="dxa" w:w="4426"/>
+          </w:tcPr>
+          <w:p>
+            <w:r/>
+            <w:r>
+              <w:rPr>
+                <w:sz w:val="18"/>
+              </w:rPr>
+              <w:t>Added explicit uniqueness rules: BR-54 (phone), BR-55 (Role.role_name), BR-56 (MembershipPackage.name), BR-57 (Room.name), BR-58 (Invoice.invoice_number). Added Section L (Unique Constraints Summary) consolidating all unique/partial-unique fields, kept in sync with Design v2 §1 (ERD) and §3 (DB constraints).</w:t>
+            </w:r>
+          </w:p>
+        </w:tc>
+        <w:tc>
+          <w:tcPr>
+            <w:tcW w:type="dxa" w:w="1500"/>
+          </w:tcPr>
+          <w:p>
+            <w:r/>
+            <w:r>
+              <w:rPr>
+                <w:sz w:val="18"/>
+              </w:rPr>
+              <w:t>1.2 draft 2</w:t>
+            </w:r>
+          </w:p>
+        </w:tc>
+      </w:tr>
+      <w:tr>
+        <w:tc>
+          <w:tcPr>
+            <w:tcW w:type="dxa" w:w="1800"/>
+          </w:tcPr>
+          <w:p>
+            <w:r>
+              <w:rPr>
+                <w:b w:val="0"/>
+                <w:sz w:val="18"/>
+              </w:rPr>
+              <w:t>SportManagement Project Team</w:t>
+            </w:r>
+          </w:p>
+        </w:tc>
+        <w:tc>
+          <w:tcPr>
+            <w:tcW w:type="dxa" w:w="1300"/>
+          </w:tcPr>
+          <w:p>
+            <w:r>
+              <w:rPr>
+                <w:b w:val="0"/>
+                <w:sz w:val="18"/>
+              </w:rPr>
+              <w:t>10/09/2026</w:t>
+            </w:r>
+          </w:p>
+        </w:tc>
+        <w:tc>
+          <w:tcPr>
+            <w:tcW w:type="dxa" w:w="4426"/>
+          </w:tcPr>
+          <w:p>
+            <w:r>
+              <w:rPr>
+                <w:b w:val="0"/>
+                <w:sz w:val="18"/>
+              </w:rPr>
+              <w:t>Added BR-59–BR-61 (Google-login anti-pre-hijacking, password-login-requires-credential, WorkoutResult-requires-Confirmed-Enrollment); added Attendance.enrollment_id row to Unique Constraints Summary (Attendance/WorkoutResult normalization pass).</w:t>
+            </w:r>
+          </w:p>
+        </w:tc>
+        <w:tc>
+          <w:tcPr>
+            <w:tcW w:type="dxa" w:w="1500"/>
+          </w:tcPr>
+          <w:p>
+            <w:r>
+              <w:rPr>
+                <w:b w:val="0"/>
+                <w:sz w:val="18"/>
+              </w:rPr>
+              <w:t>1.2 draft 3</w:t>
             </w:r>
           </w:p>
         </w:tc>
@@ -1759,6 +1875,294 @@
           </w:p>
         </w:tc>
       </w:tr>
+      <w:tr>
+        <w:tc>
+          <w:tcPr>
+            <w:tcW w:type="dxa" w:w="700"/>
+          </w:tcPr>
+          <w:p>
+            <w:r/>
+            <w:r>
+              <w:rPr>
+                <w:sz w:val="18"/>
+              </w:rPr>
+              <w:t>BR-54</w:t>
+            </w:r>
+          </w:p>
+        </w:tc>
+        <w:tc>
+          <w:tcPr>
+            <w:tcW w:type="dxa" w:w="4200"/>
+          </w:tcPr>
+          <w:p>
+            <w:r/>
+            <w:r>
+              <w:rPr>
+                <w:sz w:val="18"/>
+              </w:rPr>
+              <w:t>A user's phone number, when provided, must be unique across all accounts (a partial unique index ignoring NULL/blank values); registration or profile update is rejected on a duplicate phone number.</w:t>
+            </w:r>
+          </w:p>
+        </w:tc>
+        <w:tc>
+          <w:tcPr>
+            <w:tcW w:type="dxa" w:w="1300"/>
+          </w:tcPr>
+          <w:p>
+            <w:r/>
+            <w:r>
+              <w:rPr>
+                <w:sz w:val="18"/>
+              </w:rPr>
+              <w:t>Constraint</w:t>
+            </w:r>
+          </w:p>
+        </w:tc>
+        <w:tc>
+          <w:tcPr>
+            <w:tcW w:type="dxa" w:w="1300"/>
+          </w:tcPr>
+          <w:p>
+            <w:r/>
+            <w:r>
+              <w:rPr>
+                <w:sz w:val="18"/>
+              </w:rPr>
+              <w:t>Static</w:t>
+            </w:r>
+          </w:p>
+        </w:tc>
+        <w:tc>
+          <w:tcPr>
+            <w:tcW w:type="dxa" w:w="1526"/>
+          </w:tcPr>
+          <w:p>
+            <w:r/>
+            <w:r>
+              <w:rPr>
+                <w:sz w:val="18"/>
+              </w:rPr>
+              <w:t>Design v2 review — uniqueness audit (v1.2 draft 2)</w:t>
+            </w:r>
+          </w:p>
+        </w:tc>
+      </w:tr>
+      <w:tr>
+        <w:tc>
+          <w:tcPr>
+            <w:tcW w:type="dxa" w:w="700"/>
+          </w:tcPr>
+          <w:p>
+            <w:r/>
+            <w:r>
+              <w:rPr>
+                <w:sz w:val="18"/>
+              </w:rPr>
+              <w:t>BR-55</w:t>
+            </w:r>
+          </w:p>
+        </w:tc>
+        <w:tc>
+          <w:tcPr>
+            <w:tcW w:type="dxa" w:w="4200"/>
+          </w:tcPr>
+          <w:p>
+            <w:r/>
+            <w:r>
+              <w:rPr>
+                <w:sz w:val="18"/>
+              </w:rPr>
+              <w:t>Each of the four system roles (Center Manager, Coach, Member, Receptionist) has a globally unique role name; no two Role rows may share the same name — enforced by the fixed seed data plus a unique constraint.</w:t>
+            </w:r>
+          </w:p>
+        </w:tc>
+        <w:tc>
+          <w:tcPr>
+            <w:tcW w:type="dxa" w:w="1300"/>
+          </w:tcPr>
+          <w:p>
+            <w:r/>
+            <w:r>
+              <w:rPr>
+                <w:sz w:val="18"/>
+              </w:rPr>
+              <w:t>Fact</w:t>
+            </w:r>
+          </w:p>
+        </w:tc>
+        <w:tc>
+          <w:tcPr>
+            <w:tcW w:type="dxa" w:w="1300"/>
+          </w:tcPr>
+          <w:p>
+            <w:r/>
+            <w:r>
+              <w:rPr>
+                <w:sz w:val="18"/>
+              </w:rPr>
+              <w:t>Static</w:t>
+            </w:r>
+          </w:p>
+        </w:tc>
+        <w:tc>
+          <w:tcPr>
+            <w:tcW w:type="dxa" w:w="1526"/>
+          </w:tcPr>
+          <w:p>
+            <w:r/>
+            <w:r>
+              <w:rPr>
+                <w:sz w:val="18"/>
+              </w:rPr>
+              <w:t>Design v2 review — uniqueness audit (v1.2 draft 2)</w:t>
+            </w:r>
+          </w:p>
+        </w:tc>
+      </w:tr>
+      <w:tr>
+        <w:tc>
+          <w:tcPr>
+            <w:tcW w:type="dxa" w:w="700"/>
+          </w:tcPr>
+          <w:p>
+            <w:r>
+              <w:rPr>
+                <w:b w:val="0"/>
+                <w:sz w:val="18"/>
+              </w:rPr>
+              <w:t>BR-59</w:t>
+            </w:r>
+          </w:p>
+        </w:tc>
+        <w:tc>
+          <w:tcPr>
+            <w:tcW w:type="dxa" w:w="4200"/>
+          </w:tcPr>
+          <w:p>
+            <w:r>
+              <w:rPr>
+                <w:b w:val="0"/>
+                <w:sz w:val="18"/>
+              </w:rPr>
+              <w:t>A Google Sign-In identity may be linked to an existing local account only through an explicit "Link Google account" action performed while the user is already authenticated in that account; the system must never auto-link or auto-create an account solely because the Google profile's email matches an existing account's email (prevents account pre-hijacking).</w:t>
+            </w:r>
+          </w:p>
+        </w:tc>
+        <w:tc>
+          <w:tcPr>
+            <w:tcW w:type="dxa" w:w="1300"/>
+          </w:tcPr>
+          <w:p>
+            <w:r>
+              <w:rPr>
+                <w:b w:val="0"/>
+                <w:sz w:val="18"/>
+              </w:rPr>
+              <w:t>Constraint</w:t>
+            </w:r>
+          </w:p>
+        </w:tc>
+        <w:tc>
+          <w:tcPr>
+            <w:tcW w:type="dxa" w:w="1300"/>
+          </w:tcPr>
+          <w:p>
+            <w:r>
+              <w:rPr>
+                <w:b w:val="0"/>
+                <w:sz w:val="18"/>
+              </w:rPr>
+              <w:t>Dynamic</w:t>
+            </w:r>
+          </w:p>
+        </w:tc>
+        <w:tc>
+          <w:tcPr>
+            <w:tcW w:type="dxa" w:w="1526"/>
+          </w:tcPr>
+          <w:p>
+            <w:r>
+              <w:rPr>
+                <w:b w:val="0"/>
+                <w:sz w:val="18"/>
+              </w:rPr>
+              <w:t>Design v2 review — Google Login security (v1.2 draft 3, added 10/09/2026)</w:t>
+            </w:r>
+          </w:p>
+        </w:tc>
+      </w:tr>
+      <w:tr>
+        <w:tc>
+          <w:tcPr>
+            <w:tcW w:type="dxa" w:w="700"/>
+          </w:tcPr>
+          <w:p>
+            <w:r>
+              <w:rPr>
+                <w:b w:val="0"/>
+                <w:sz w:val="18"/>
+              </w:rPr>
+              <w:t>BR-60</w:t>
+            </w:r>
+          </w:p>
+        </w:tc>
+        <w:tc>
+          <w:tcPr>
+            <w:tcW w:type="dxa" w:w="4200"/>
+          </w:tcPr>
+          <w:p>
+            <w:r>
+              <w:rPr>
+                <w:b w:val="0"/>
+                <w:sz w:val="18"/>
+              </w:rPr>
+              <w:t>A user may authenticate with email/password only if that account's UserCredential.password_hash is not null. An account created exclusively via Google Sign-In (no password ever set) must sign in via Google until the user explicitly sets a password from within an authenticated session.</w:t>
+            </w:r>
+          </w:p>
+        </w:tc>
+        <w:tc>
+          <w:tcPr>
+            <w:tcW w:type="dxa" w:w="1300"/>
+          </w:tcPr>
+          <w:p>
+            <w:r>
+              <w:rPr>
+                <w:b w:val="0"/>
+                <w:sz w:val="18"/>
+              </w:rPr>
+              <w:t>Constraint</w:t>
+            </w:r>
+          </w:p>
+        </w:tc>
+        <w:tc>
+          <w:tcPr>
+            <w:tcW w:type="dxa" w:w="1300"/>
+          </w:tcPr>
+          <w:p>
+            <w:r>
+              <w:rPr>
+                <w:b w:val="0"/>
+                <w:sz w:val="18"/>
+              </w:rPr>
+              <w:t>Static</w:t>
+            </w:r>
+          </w:p>
+        </w:tc>
+        <w:tc>
+          <w:tcPr>
+            <w:tcW w:type="dxa" w:w="1526"/>
+          </w:tcPr>
+          <w:p>
+            <w:r>
+              <w:rPr>
+                <w:b w:val="0"/>
+                <w:sz w:val="18"/>
+              </w:rPr>
+              <w:t>Design v2 review — Google Login security (v1.2 draft 3, added 10/09/2026)</w:t>
+            </w:r>
+          </w:p>
+        </w:tc>
+      </w:tr>
     </w:tbl>
     <w:p>
       <w:pPr>
@@ -2452,6 +2856,78 @@
                 <w:szCs w:val="18"/>
               </w:rPr>
               <w:t xml:space="preserve">Derived from Original BR-01 / BR-05</w:t>
+            </w:r>
+          </w:p>
+        </w:tc>
+      </w:tr>
+      <w:tr>
+        <w:tc>
+          <w:tcPr>
+            <w:tcW w:type="dxa" w:w="700"/>
+          </w:tcPr>
+          <w:p>
+            <w:r/>
+            <w:r>
+              <w:rPr>
+                <w:sz w:val="18"/>
+              </w:rPr>
+              <w:t>BR-56</w:t>
+            </w:r>
+          </w:p>
+        </w:tc>
+        <w:tc>
+          <w:tcPr>
+            <w:tcW w:type="dxa" w:w="4200"/>
+          </w:tcPr>
+          <w:p>
+            <w:r/>
+            <w:r>
+              <w:rPr>
+                <w:sz w:val="18"/>
+              </w:rPr>
+              <w:t>Within the membership package catalog, no two MembershipPackage records may share the same Name; the Center Manager cannot create or rename a package to a name already in use by another package.</w:t>
+            </w:r>
+          </w:p>
+        </w:tc>
+        <w:tc>
+          <w:tcPr>
+            <w:tcW w:type="dxa" w:w="1300"/>
+          </w:tcPr>
+          <w:p>
+            <w:r/>
+            <w:r>
+              <w:rPr>
+                <w:sz w:val="18"/>
+              </w:rPr>
+              <w:t>Constraint</w:t>
+            </w:r>
+          </w:p>
+        </w:tc>
+        <w:tc>
+          <w:tcPr>
+            <w:tcW w:type="dxa" w:w="1300"/>
+          </w:tcPr>
+          <w:p>
+            <w:r/>
+            <w:r>
+              <w:rPr>
+                <w:sz w:val="18"/>
+              </w:rPr>
+              <w:t>Static</w:t>
+            </w:r>
+          </w:p>
+        </w:tc>
+        <w:tc>
+          <w:tcPr>
+            <w:tcW w:type="dxa" w:w="1526"/>
+          </w:tcPr>
+          <w:p>
+            <w:r/>
+            <w:r>
+              <w:rPr>
+                <w:sz w:val="18"/>
+              </w:rPr>
+              <w:t>Design v2 review — uniqueness audit (v1.2 draft 2)</w:t>
             </w:r>
           </w:p>
         </w:tc>
@@ -3285,6 +3761,78 @@
           </w:p>
         </w:tc>
       </w:tr>
+      <w:tr>
+        <w:tc>
+          <w:tcPr>
+            <w:tcW w:type="dxa" w:w="700"/>
+          </w:tcPr>
+          <w:p>
+            <w:r/>
+            <w:r>
+              <w:rPr>
+                <w:sz w:val="18"/>
+              </w:rPr>
+              <w:t>BR-57</w:t>
+            </w:r>
+          </w:p>
+        </w:tc>
+        <w:tc>
+          <w:tcPr>
+            <w:tcW w:type="dxa" w:w="4200"/>
+          </w:tcPr>
+          <w:p>
+            <w:r/>
+            <w:r>
+              <w:rPr>
+                <w:sz w:val="18"/>
+              </w:rPr>
+              <w:t>Each Room has a unique Name across the center, since the name is used to identify the physical room in schedules and booking screens; the Center Manager cannot create two rooms with the same name.</w:t>
+            </w:r>
+          </w:p>
+        </w:tc>
+        <w:tc>
+          <w:tcPr>
+            <w:tcW w:type="dxa" w:w="1300"/>
+          </w:tcPr>
+          <w:p>
+            <w:r/>
+            <w:r>
+              <w:rPr>
+                <w:sz w:val="18"/>
+              </w:rPr>
+              <w:t>Constraint</w:t>
+            </w:r>
+          </w:p>
+        </w:tc>
+        <w:tc>
+          <w:tcPr>
+            <w:tcW w:type="dxa" w:w="1300"/>
+          </w:tcPr>
+          <w:p>
+            <w:r/>
+            <w:r>
+              <w:rPr>
+                <w:sz w:val="18"/>
+              </w:rPr>
+              <w:t>Static</w:t>
+            </w:r>
+          </w:p>
+        </w:tc>
+        <w:tc>
+          <w:tcPr>
+            <w:tcW w:type="dxa" w:w="1526"/>
+          </w:tcPr>
+          <w:p>
+            <w:r/>
+            <w:r>
+              <w:rPr>
+                <w:sz w:val="18"/>
+              </w:rPr>
+              <w:t>Design v2 review — uniqueness audit (v1.2 draft 2)</w:t>
+            </w:r>
+          </w:p>
+        </w:tc>
+      </w:tr>
     </w:tbl>
     <w:p>
       <w:pPr>
@@ -5376,6 +5924,78 @@
           </w:p>
         </w:tc>
       </w:tr>
+      <w:tr>
+        <w:tc>
+          <w:tcPr>
+            <w:tcW w:type="dxa" w:w="700"/>
+          </w:tcPr>
+          <w:p>
+            <w:r>
+              <w:rPr>
+                <w:b w:val="0"/>
+                <w:sz w:val="18"/>
+              </w:rPr>
+              <w:t>BR-61</w:t>
+            </w:r>
+          </w:p>
+        </w:tc>
+        <w:tc>
+          <w:tcPr>
+            <w:tcW w:type="dxa" w:w="4200"/>
+          </w:tcPr>
+          <w:p>
+            <w:r>
+              <w:rPr>
+                <w:b w:val="0"/>
+                <w:sz w:val="18"/>
+              </w:rPr>
+              <w:t>A Workout Result may be recorded only against an Enrollment whose status is Confirmed at the time of recording, ensuring a result can only exist for a Member who genuinely registered for that class session (extends BR-24).</w:t>
+            </w:r>
+          </w:p>
+        </w:tc>
+        <w:tc>
+          <w:tcPr>
+            <w:tcW w:type="dxa" w:w="1300"/>
+          </w:tcPr>
+          <w:p>
+            <w:r>
+              <w:rPr>
+                <w:b w:val="0"/>
+                <w:sz w:val="18"/>
+              </w:rPr>
+              <w:t>Constraint</w:t>
+            </w:r>
+          </w:p>
+        </w:tc>
+        <w:tc>
+          <w:tcPr>
+            <w:tcW w:type="dxa" w:w="1300"/>
+          </w:tcPr>
+          <w:p>
+            <w:r>
+              <w:rPr>
+                <w:b w:val="0"/>
+                <w:sz w:val="18"/>
+              </w:rPr>
+              <w:t>Dynamic</w:t>
+            </w:r>
+          </w:p>
+        </w:tc>
+        <w:tc>
+          <w:tcPr>
+            <w:tcW w:type="dxa" w:w="1526"/>
+          </w:tcPr>
+          <w:p>
+            <w:r>
+              <w:rPr>
+                <w:b w:val="0"/>
+                <w:sz w:val="18"/>
+              </w:rPr>
+              <w:t>Design v2 review — Attendance/WorkoutResult normalization (v1.2 draft 3, added 10/09/2026)</w:t>
+            </w:r>
+          </w:p>
+        </w:tc>
+      </w:tr>
     </w:tbl>
     <w:p>
       <w:pPr>
@@ -7298,6 +7918,78 @@
           </w:p>
         </w:tc>
       </w:tr>
+      <w:tr>
+        <w:tc>
+          <w:tcPr>
+            <w:tcW w:type="dxa" w:w="700"/>
+          </w:tcPr>
+          <w:p>
+            <w:r/>
+            <w:r>
+              <w:rPr>
+                <w:sz w:val="18"/>
+              </w:rPr>
+              <w:t>BR-58</w:t>
+            </w:r>
+          </w:p>
+        </w:tc>
+        <w:tc>
+          <w:tcPr>
+            <w:tcW w:type="dxa" w:w="4200"/>
+          </w:tcPr>
+          <w:p>
+            <w:r/>
+            <w:r>
+              <w:rPr>
+                <w:sz w:val="18"/>
+              </w:rPr>
+              <w:t>Every Invoice has a globally unique, human-readable InvoiceNumber generated from a DB sequence (never randomly assigned at the app layer), guaranteeing no duplicate invoice numbers even when two invoices are created concurrently.</w:t>
+            </w:r>
+          </w:p>
+        </w:tc>
+        <w:tc>
+          <w:tcPr>
+            <w:tcW w:type="dxa" w:w="1300"/>
+          </w:tcPr>
+          <w:p>
+            <w:r/>
+            <w:r>
+              <w:rPr>
+                <w:sz w:val="18"/>
+              </w:rPr>
+              <w:t>Constraint</w:t>
+            </w:r>
+          </w:p>
+        </w:tc>
+        <w:tc>
+          <w:tcPr>
+            <w:tcW w:type="dxa" w:w="1300"/>
+          </w:tcPr>
+          <w:p>
+            <w:r/>
+            <w:r>
+              <w:rPr>
+                <w:sz w:val="18"/>
+              </w:rPr>
+              <w:t>Static</w:t>
+            </w:r>
+          </w:p>
+        </w:tc>
+        <w:tc>
+          <w:tcPr>
+            <w:tcW w:type="dxa" w:w="1526"/>
+          </w:tcPr>
+          <w:p>
+            <w:r/>
+            <w:r>
+              <w:rPr>
+                <w:sz w:val="18"/>
+              </w:rPr>
+              <w:t>Design v2 review — uniqueness audit (v1.2 draft 2); formalizes Design v2 §3 constraint #5</w:t>
+            </w:r>
+          </w:p>
+        </w:tc>
+      </w:tr>
     </w:tbl>
     <w:p>
       <w:pPr>
@@ -9385,6 +10077,676 @@
                 <w:szCs w:val="18"/>
               </w:rPr>
               <w:t xml:space="preserve">Original BR-06</w:t>
+            </w:r>
+          </w:p>
+        </w:tc>
+      </w:tr>
+    </w:tbl>
+    <w:p>
+      <w:pPr>
+        <w:pStyle w:val="Heading1"/>
+      </w:pPr>
+      <w:r>
+        <w:t>L. Unique Constraints Summary (added 10/09/2026)</w:t>
+      </w:r>
+    </w:p>
+    <w:p>
+      <w:r>
+        <w:t>Consolidated list of every unique / partial-unique field or field combination in the schema, so "which fields must be unique" is answered in one place instead of scattered across rule groups. Kept in sync with Design v2 §1 (ERD "UK" markers) and §3 (DB constraint table).</w:t>
+      </w:r>
+    </w:p>
+    <w:tbl>
+      <w:tblPr>
+        <w:tblW w:type="dxa" w:w="9026"/>
+        <w:tblBorders>
+          <w:top w:val="single" w:color="auto" w:sz="4"/>
+          <w:left w:val="single" w:color="auto" w:sz="4"/>
+          <w:bottom w:val="single" w:color="auto" w:sz="4"/>
+          <w:right w:val="single" w:color="auto" w:sz="4"/>
+          <w:insideH w:val="single" w:color="auto" w:sz="4"/>
+          <w:insideV w:val="single" w:color="auto" w:sz="4"/>
+        </w:tblBorders>
+      </w:tblPr>
+      <w:tblGrid>
+        <w:gridCol w:w="2256"/>
+        <w:gridCol w:w="2256"/>
+        <w:gridCol w:w="2256"/>
+        <w:gridCol w:w="2256"/>
+      </w:tblGrid>
+      <w:tr>
+        <w:tc>
+          <w:tcPr>
+            <w:tcW w:type="dxa" w:w="2256"/>
+          </w:tcPr>
+          <w:p>
+            <w:r/>
+            <w:r>
+              <w:rPr>
+                <w:sz w:val="18"/>
+              </w:rPr>
+              <w:t>Entity.Field</w:t>
+            </w:r>
+          </w:p>
+        </w:tc>
+        <w:tc>
+          <w:tcPr>
+            <w:tcW w:type="dxa" w:w="2256"/>
+          </w:tcPr>
+          <w:p>
+            <w:r/>
+            <w:r>
+              <w:rPr>
+                <w:sz w:val="18"/>
+              </w:rPr>
+              <w:t>Phạm vi Unique</w:t>
+            </w:r>
+          </w:p>
+        </w:tc>
+        <w:tc>
+          <w:tcPr>
+            <w:tcW w:type="dxa" w:w="2256"/>
+          </w:tcPr>
+          <w:p>
+            <w:r/>
+            <w:r>
+              <w:rPr>
+                <w:sz w:val="18"/>
+              </w:rPr>
+              <w:t>Cơ chế thực thi (DB)</w:t>
+            </w:r>
+          </w:p>
+        </w:tc>
+        <w:tc>
+          <w:tcPr>
+            <w:tcW w:type="dxa" w:w="2256"/>
+          </w:tcPr>
+          <w:p>
+            <w:r/>
+            <w:r>
+              <w:rPr>
+                <w:sz w:val="18"/>
+              </w:rPr>
+              <w:t>BR / Ghi chú</w:t>
+            </w:r>
+          </w:p>
+        </w:tc>
+      </w:tr>
+      <w:tr>
+        <w:tc>
+          <w:tcPr>
+            <w:tcW w:type="dxa" w:w="2256"/>
+          </w:tcPr>
+          <w:p>
+            <w:r/>
+            <w:r>
+              <w:rPr>
+                <w:sz w:val="18"/>
+              </w:rPr>
+              <w:t>User.email</w:t>
+            </w:r>
+          </w:p>
+        </w:tc>
+        <w:tc>
+          <w:tcPr>
+            <w:tcW w:type="dxa" w:w="2256"/>
+          </w:tcPr>
+          <w:p>
+            <w:r/>
+            <w:r>
+              <w:rPr>
+                <w:sz w:val="18"/>
+              </w:rPr>
+              <w:t>Toàn hệ thống, không phân biệt hoa/thường</w:t>
+            </w:r>
+          </w:p>
+        </w:tc>
+        <w:tc>
+          <w:tcPr>
+            <w:tcW w:type="dxa" w:w="2256"/>
+          </w:tcPr>
+          <w:p>
+            <w:r/>
+            <w:r>
+              <w:rPr>
+                <w:sz w:val="18"/>
+              </w:rPr>
+              <w:t>UNIQUE INDEX trên LOWER(email), hoặc kiểu citext</w:t>
+            </w:r>
+          </w:p>
+        </w:tc>
+        <w:tc>
+          <w:tcPr>
+            <w:tcW w:type="dxa" w:w="2256"/>
+          </w:tcPr>
+          <w:p>
+            <w:r/>
+            <w:r>
+              <w:rPr>
+                <w:sz w:val="18"/>
+              </w:rPr>
+              <w:t>BR-1, BR-49</w:t>
+            </w:r>
+          </w:p>
+        </w:tc>
+      </w:tr>
+      <w:tr>
+        <w:tc>
+          <w:tcPr>
+            <w:tcW w:type="dxa" w:w="2256"/>
+          </w:tcPr>
+          <w:p>
+            <w:r/>
+            <w:r>
+              <w:rPr>
+                <w:sz w:val="18"/>
+              </w:rPr>
+              <w:t>User.phone</w:t>
+            </w:r>
+          </w:p>
+        </w:tc>
+        <w:tc>
+          <w:tcPr>
+            <w:tcW w:type="dxa" w:w="2256"/>
+          </w:tcPr>
+          <w:p>
+            <w:r/>
+            <w:r>
+              <w:rPr>
+                <w:sz w:val="18"/>
+              </w:rPr>
+              <w:t>Toàn hệ thống (bỏ qua NULL/rỗng)</w:t>
+            </w:r>
+          </w:p>
+        </w:tc>
+        <w:tc>
+          <w:tcPr>
+            <w:tcW w:type="dxa" w:w="2256"/>
+          </w:tcPr>
+          <w:p>
+            <w:r/>
+            <w:r>
+              <w:rPr>
+                <w:sz w:val="18"/>
+              </w:rPr>
+              <w:t>Partial UNIQUE INDEX WHERE phone IS NOT NULL</w:t>
+            </w:r>
+          </w:p>
+        </w:tc>
+        <w:tc>
+          <w:tcPr>
+            <w:tcW w:type="dxa" w:w="2256"/>
+          </w:tcPr>
+          <w:p>
+            <w:r/>
+            <w:r>
+              <w:rPr>
+                <w:sz w:val="18"/>
+              </w:rPr>
+              <w:t>BR-54</w:t>
+            </w:r>
+          </w:p>
+        </w:tc>
+      </w:tr>
+      <w:tr>
+        <w:tc>
+          <w:tcPr>
+            <w:tcW w:type="dxa" w:w="2256"/>
+          </w:tcPr>
+          <w:p>
+            <w:r/>
+            <w:r>
+              <w:rPr>
+                <w:sz w:val="18"/>
+              </w:rPr>
+              <w:t>Role.role_name</w:t>
+            </w:r>
+          </w:p>
+        </w:tc>
+        <w:tc>
+          <w:tcPr>
+            <w:tcW w:type="dxa" w:w="2256"/>
+          </w:tcPr>
+          <w:p>
+            <w:r/>
+            <w:r>
+              <w:rPr>
+                <w:sz w:val="18"/>
+              </w:rPr>
+              <w:t>Toàn hệ thống (chỉ 4 giá trị cố định)</w:t>
+            </w:r>
+          </w:p>
+        </w:tc>
+        <w:tc>
+          <w:tcPr>
+            <w:tcW w:type="dxa" w:w="2256"/>
+          </w:tcPr>
+          <w:p>
+            <w:r/>
+            <w:r>
+              <w:rPr>
+                <w:sz w:val="18"/>
+              </w:rPr>
+              <w:t>UNIQUE constraint + seed data cố định (4 dòng)</w:t>
+            </w:r>
+          </w:p>
+        </w:tc>
+        <w:tc>
+          <w:tcPr>
+            <w:tcW w:type="dxa" w:w="2256"/>
+          </w:tcPr>
+          <w:p>
+            <w:r/>
+            <w:r>
+              <w:rPr>
+                <w:sz w:val="18"/>
+              </w:rPr>
+              <w:t>BR-55</w:t>
+            </w:r>
+          </w:p>
+        </w:tc>
+      </w:tr>
+      <w:tr>
+        <w:tc>
+          <w:tcPr>
+            <w:tcW w:type="dxa" w:w="2256"/>
+          </w:tcPr>
+          <w:p>
+            <w:r/>
+            <w:r>
+              <w:rPr>
+                <w:sz w:val="18"/>
+              </w:rPr>
+              <w:t>MembershipPackage.name</w:t>
+            </w:r>
+          </w:p>
+        </w:tc>
+        <w:tc>
+          <w:tcPr>
+            <w:tcW w:type="dxa" w:w="2256"/>
+          </w:tcPr>
+          <w:p>
+            <w:r/>
+            <w:r>
+              <w:rPr>
+                <w:sz w:val="18"/>
+              </w:rPr>
+              <w:t>Trong toàn bộ danh mục gói</w:t>
+            </w:r>
+          </w:p>
+        </w:tc>
+        <w:tc>
+          <w:tcPr>
+            <w:tcW w:type="dxa" w:w="2256"/>
+          </w:tcPr>
+          <w:p>
+            <w:r/>
+            <w:r>
+              <w:rPr>
+                <w:sz w:val="18"/>
+              </w:rPr>
+              <w:t>UNIQUE constraint</w:t>
+            </w:r>
+          </w:p>
+        </w:tc>
+        <w:tc>
+          <w:tcPr>
+            <w:tcW w:type="dxa" w:w="2256"/>
+          </w:tcPr>
+          <w:p>
+            <w:r/>
+            <w:r>
+              <w:rPr>
+                <w:sz w:val="18"/>
+              </w:rPr>
+              <w:t>BR-56</w:t>
+            </w:r>
+          </w:p>
+        </w:tc>
+      </w:tr>
+      <w:tr>
+        <w:tc>
+          <w:tcPr>
+            <w:tcW w:type="dxa" w:w="2256"/>
+          </w:tcPr>
+          <w:p>
+            <w:r/>
+            <w:r>
+              <w:rPr>
+                <w:sz w:val="18"/>
+              </w:rPr>
+              <w:t>Room.name</w:t>
+            </w:r>
+          </w:p>
+        </w:tc>
+        <w:tc>
+          <w:tcPr>
+            <w:tcW w:type="dxa" w:w="2256"/>
+          </w:tcPr>
+          <w:p>
+            <w:r/>
+            <w:r>
+              <w:rPr>
+                <w:sz w:val="18"/>
+              </w:rPr>
+              <w:t>Toàn trung tâm</w:t>
+            </w:r>
+          </w:p>
+        </w:tc>
+        <w:tc>
+          <w:tcPr>
+            <w:tcW w:type="dxa" w:w="2256"/>
+          </w:tcPr>
+          <w:p>
+            <w:r/>
+            <w:r>
+              <w:rPr>
+                <w:sz w:val="18"/>
+              </w:rPr>
+              <w:t>UNIQUE constraint</w:t>
+            </w:r>
+          </w:p>
+        </w:tc>
+        <w:tc>
+          <w:tcPr>
+            <w:tcW w:type="dxa" w:w="2256"/>
+          </w:tcPr>
+          <w:p>
+            <w:r/>
+            <w:r>
+              <w:rPr>
+                <w:sz w:val="18"/>
+              </w:rPr>
+              <w:t>BR-57</w:t>
+            </w:r>
+          </w:p>
+        </w:tc>
+      </w:tr>
+      <w:tr>
+        <w:tc>
+          <w:tcPr>
+            <w:tcW w:type="dxa" w:w="2256"/>
+          </w:tcPr>
+          <w:p>
+            <w:r/>
+            <w:r>
+              <w:rPr>
+                <w:sz w:val="18"/>
+              </w:rPr>
+              <w:t>Invoice.invoice_number</w:t>
+            </w:r>
+          </w:p>
+        </w:tc>
+        <w:tc>
+          <w:tcPr>
+            <w:tcW w:type="dxa" w:w="2256"/>
+          </w:tcPr>
+          <w:p>
+            <w:r/>
+            <w:r>
+              <w:rPr>
+                <w:sz w:val="18"/>
+              </w:rPr>
+              <w:t>Toàn hệ thống, sinh từ DB sequence</w:t>
+            </w:r>
+          </w:p>
+        </w:tc>
+        <w:tc>
+          <w:tcPr>
+            <w:tcW w:type="dxa" w:w="2256"/>
+          </w:tcPr>
+          <w:p>
+            <w:r/>
+            <w:r>
+              <w:rPr>
+                <w:sz w:val="18"/>
+              </w:rPr>
+              <w:t>UNIQUE constraint + nextval() (không random ở app layer)</w:t>
+            </w:r>
+          </w:p>
+        </w:tc>
+        <w:tc>
+          <w:tcPr>
+            <w:tcW w:type="dxa" w:w="2256"/>
+          </w:tcPr>
+          <w:p>
+            <w:r/>
+            <w:r>
+              <w:rPr>
+                <w:sz w:val="18"/>
+              </w:rPr>
+              <w:t>BR-30, BR-40, BR-58</w:t>
+            </w:r>
+          </w:p>
+        </w:tc>
+      </w:tr>
+      <w:tr>
+        <w:tc>
+          <w:tcPr>
+            <w:tcW w:type="dxa" w:w="2256"/>
+          </w:tcPr>
+          <w:p>
+            <w:r/>
+            <w:r>
+              <w:rPr>
+                <w:sz w:val="18"/>
+              </w:rPr>
+              <w:t>MemberTrainingProfile.member_id</w:t>
+            </w:r>
+          </w:p>
+        </w:tc>
+        <w:tc>
+          <w:tcPr>
+            <w:tcW w:type="dxa" w:w="2256"/>
+          </w:tcPr>
+          <w:p>
+            <w:r/>
+            <w:r>
+              <w:rPr>
+                <w:sz w:val="18"/>
+              </w:rPr>
+              <w:t>1 Member chỉ có 1 hồ sơ (1–1 với User)</w:t>
+            </w:r>
+          </w:p>
+        </w:tc>
+        <w:tc>
+          <w:tcPr>
+            <w:tcW w:type="dxa" w:w="2256"/>
+          </w:tcPr>
+          <w:p>
+            <w:r/>
+            <w:r>
+              <w:rPr>
+                <w:sz w:val="18"/>
+              </w:rPr>
+              <w:t>UNIQUE constraint trên FK member_id</w:t>
+            </w:r>
+          </w:p>
+        </w:tc>
+        <w:tc>
+          <w:tcPr>
+            <w:tcW w:type="dxa" w:w="2256"/>
+          </w:tcPr>
+          <w:p>
+            <w:r/>
+            <w:r>
+              <w:rPr>
+                <w:sz w:val="18"/>
+              </w:rPr>
+              <w:t>BR-9 (ngầm định qua quan hệ 1–1)</w:t>
+            </w:r>
+          </w:p>
+        </w:tc>
+      </w:tr>
+      <w:tr>
+        <w:tc>
+          <w:tcPr>
+            <w:tcW w:type="dxa" w:w="2256"/>
+          </w:tcPr>
+          <w:p>
+            <w:r/>
+            <w:r>
+              <w:rPr>
+                <w:sz w:val="18"/>
+              </w:rPr>
+              <w:t>Enrollment (session_id, member_id) khi status = CONFIRMED</w:t>
+            </w:r>
+          </w:p>
+        </w:tc>
+        <w:tc>
+          <w:tcPr>
+            <w:tcW w:type="dxa" w:w="2256"/>
+          </w:tcPr>
+          <w:p>
+            <w:r/>
+            <w:r>
+              <w:rPr>
+                <w:sz w:val="18"/>
+              </w:rPr>
+              <w:t>Không được có 2 đăng ký CONFIRMED trùng cùng 1 session</w:t>
+            </w:r>
+          </w:p>
+        </w:tc>
+        <w:tc>
+          <w:tcPr>
+            <w:tcW w:type="dxa" w:w="2256"/>
+          </w:tcPr>
+          <w:p>
+            <w:r/>
+            <w:r>
+              <w:rPr>
+                <w:sz w:val="18"/>
+              </w:rPr>
+              <w:t>Partial UNIQUE INDEX WHERE status = 'CONFIRMED'</w:t>
+            </w:r>
+          </w:p>
+        </w:tc>
+        <w:tc>
+          <w:tcPr>
+            <w:tcW w:type="dxa" w:w="2256"/>
+          </w:tcPr>
+          <w:p>
+            <w:r/>
+            <w:r>
+              <w:rPr>
+                <w:sz w:val="18"/>
+              </w:rPr>
+              <w:t>BR-19; Design v2 §3 constraint #1</w:t>
+            </w:r>
+          </w:p>
+        </w:tc>
+      </w:tr>
+      <w:tr>
+        <w:tc>
+          <w:tcPr>
+            <w:tcW w:type="dxa" w:w="2256"/>
+          </w:tcPr>
+          <w:p>
+            <w:r/>
+            <w:r>
+              <w:rPr>
+                <w:sz w:val="18"/>
+              </w:rPr>
+              <w:t>CoachMemberRelationship (coach_id, member_id) khi status = ACTIVE</w:t>
+            </w:r>
+          </w:p>
+        </w:tc>
+        <w:tc>
+          <w:tcPr>
+            <w:tcW w:type="dxa" w:w="2256"/>
+          </w:tcPr>
+          <w:p>
+            <w:r/>
+            <w:r>
+              <w:rPr>
+                <w:sz w:val="18"/>
+              </w:rPr>
+              <w:t>Chỉ 1 quan hệ ACTIVE giữa 1 cặp Coach–Member tại 1 thời điểm</w:t>
+            </w:r>
+          </w:p>
+        </w:tc>
+        <w:tc>
+          <w:tcPr>
+            <w:tcW w:type="dxa" w:w="2256"/>
+          </w:tcPr>
+          <w:p>
+            <w:r/>
+            <w:r>
+              <w:rPr>
+                <w:sz w:val="18"/>
+              </w:rPr>
+              <w:t>Partial UNIQUE INDEX WHERE status = 'ACTIVE'</w:t>
+            </w:r>
+          </w:p>
+        </w:tc>
+        <w:tc>
+          <w:tcPr>
+            <w:tcW w:type="dxa" w:w="2256"/>
+          </w:tcPr>
+          <w:p>
+            <w:r/>
+            <w:r>
+              <w:rPr>
+                <w:sz w:val="18"/>
+              </w:rPr>
+              <w:t>BR-23/BR-24 (ngầm định); Design v2 §3 constraint #7</w:t>
+            </w:r>
+          </w:p>
+        </w:tc>
+      </w:tr>
+      <w:tr>
+        <w:tc>
+          <w:tcPr>
+            <w:tcW w:type="dxa" w:w="2256"/>
+          </w:tcPr>
+          <w:p>
+            <w:r>
+              <w:rPr>
+                <w:b w:val="0"/>
+                <w:sz w:val="18"/>
+              </w:rPr>
+              <w:t>Attendance.enrollment_id</w:t>
+            </w:r>
+          </w:p>
+        </w:tc>
+        <w:tc>
+          <w:tcPr>
+            <w:tcW w:type="dxa" w:w="2256"/>
+          </w:tcPr>
+          <w:p>
+            <w:r>
+              <w:rPr>
+                <w:b w:val="0"/>
+                <w:sz w:val="18"/>
+              </w:rPr>
+              <w:t>1 Enrollment chỉ có tối đa 1 Attendance (1–1); session_id/member_id không lưu riêng, suy ra qua Enrollment</w:t>
+            </w:r>
+          </w:p>
+        </w:tc>
+        <w:tc>
+          <w:tcPr>
+            <w:tcW w:type="dxa" w:w="2256"/>
+          </w:tcPr>
+          <w:p>
+            <w:r>
+              <w:rPr>
+                <w:b w:val="0"/>
+                <w:sz w:val="18"/>
+              </w:rPr>
+              <w:t>UNIQUE constraint trên FK enrollment_id</w:t>
+            </w:r>
+          </w:p>
+        </w:tc>
+        <w:tc>
+          <w:tcPr>
+            <w:tcW w:type="dxa" w:w="2256"/>
+          </w:tcPr>
+          <w:p>
+            <w:r>
+              <w:rPr>
+                <w:b w:val="0"/>
+                <w:sz w:val="18"/>
+              </w:rPr>
+              <w:t>Design v2 §3 constraint #17 (added 10/09/2026)</w:t>
             </w:r>
           </w:p>
         </w:tc>

</xml_diff>